<commit_message>
T2: congruencia final de los 22 puntos, sensibilidad al CPA en #17, ROI de marketing 74 %, Word finales
Co-Authored-By: Claude Opus 5.5 <noreply@anthropic.com>
Claude-Session: https://claude.ai/code/session_01Kfbf7cfV7pXUcNjjyaPCzV
</commit_message>
<xml_diff>
--- a/04-reformulacion/T2/docx/T2_06_Proyeccion-de-demanda.docx
+++ b/04-reformulacion/T2/docx/T2_06_Proyeccion-de-demanda.docx
@@ -8700,7 +8700,7 @@
         <w:t xml:space="preserve">brownies por día en cada punto</w:t>
       </w:r>
       <w:r>
-        <w:t xml:space="preserve"> (fila 7 de la hoja Mensual). La recompra por WhatsApp se recalcula sola (35 % del físico del mes anterior). Ferias, eventos, colegios y naturistas se dejan igual. Esta definición la deducimos al reproducir las cifras con las fórmulas del Excel [PROPUESTA de lectura; confirmar con Carlos].</w:t>
+        <w:t xml:space="preserve"> (fila 7 de la hoja Mensual). La recompra por WhatsApp se recalcula sola (35 % del físico del mes anterior). Ferias, eventos, colegios y naturistas se dejan igual. Es la definición del Excel v7: la nota 5 de la hoja Resumen y la celda C53 de la hoja Inversion hablan de "20 % menos ventas por punto". Las cifras se reprodujeron con las fórmulas del Excel. Es el mismo escenario que usan HECHOS_v7, el documento 00, el #17 y el #19.</w:t>
       </w:r>
     </w:p>
     <w:tbl>
@@ -9347,7 +9347,7 @@
         <w:t xml:space="preserve">20 % menos</w:t>
       </w:r>
       <w:r>
-        <w:t xml:space="preserve">, el año 1 todavía gana (S/608), pero casi nada. La caja más baja baja de S/2,545 a </w:t>
+        <w:t xml:space="preserve">, el año 1 todavía gana (S/608), pero casi nada. La caja más baja pasa de S/2,545 (febrero, en el plan base) a </w:t>
       </w:r>
       <w:r>
         <w:rPr>
@@ -9357,7 +9357,7 @@
         <w:t xml:space="preserve">−S/2,188</w:t>
       </w:r>
       <w:r>
-        <w:t xml:space="preserve"> en febrero. La cubre la </w:t>
+        <w:t xml:space="preserve"> en agosto de 2027: la caja baja de S/1,000 desde abril y toca fondo en agosto. La cubre la </w:t>
       </w:r>
       <w:r>
         <w:rPr>
@@ -9525,7 +9525,7 @@
         <w:spacing w:after="60"/>
       </w:pPr>
       <w:r>
-        <w:t xml:space="preserve">AndiBite. *Costeo-presentaciones-AndiBite.xlsx*, modelo v7, hojas Mensual (filas 5 a 19 y 29), Anio2, Resumen y Proyeccion (</w:t>
+        <w:t xml:space="preserve">AndiBite. </w:t>
       </w:r>
       <w:r>
         <w:rPr>
@@ -9534,10 +9534,10 @@
           <w:sz w:val="19"/>
           <w:szCs w:val="19"/>
         </w:rPr>
-        <w:t xml:space="preserve">04-reformulacion/</w:t>
-      </w:r>
-      <w:r>
-        <w:t xml:space="preserve">).</w:t>
+        <w:t xml:space="preserve">04-reformulacion/Costeo-presentaciones-AndiBite.xlsx</w:t>
+      </w:r>
+      <w:r>
+        <w:t xml:space="preserve">, modelo v7, hojas Mensual (filas 5 a 19, 29 y 44), Anio2, Resumen (nota 5), Inversion (celda C53) y Proyeccion.</w:t>
       </w:r>
     </w:p>
     <w:p>
@@ -9625,7 +9625,7 @@
         <w:spacing w:after="60"/>
       </w:pPr>
       <w:r>
-        <w:t xml:space="preserve">APEIM. *Niveles Socioeconómicos 2025* (setiembre de 2025). https://apeim.com.pe/wp-content/uploads/2025/12/Informe-completo-de-NSE-2025.pdf</w:t>
+        <w:t xml:space="preserve">APEIM. Niveles Socioeconómicos 2025 (setiembre de 2025). https://apeim.com.pe/wp-content/uploads/2025/12/Informe-completo-de-NSE-2025.pdf</w:t>
       </w:r>
     </w:p>
     <w:p>
@@ -9638,7 +9638,7 @@
         <w:spacing w:after="60"/>
       </w:pPr>
       <w:r>
-        <w:t xml:space="preserve">CPI. *Market Report N°003: Perú, Población 2026* (marzo de 2026). https://cpi.pe/wp-content/uploads/2026/03/CPI_Market-Report-N°003-Proyecciones-Poblacionales-2025.pdf</w:t>
+        <w:t xml:space="preserve">CPI. Market Report N°003: Perú, Población 2026 (marzo de 2026). https://cpi.pe/wp-content/uploads/2026/03/CPI_Market-Report-N°003-Proyecciones-Poblacionales-2025.pdf</w:t>
       </w:r>
     </w:p>
     <w:p>

</xml_diff>